<commit_message>
chore: updated report with new features and tomorrow's submission date
</commit_message>
<xml_diff>
--- a/Module42_Project_Report.docx
+++ b/Module42_Project_Report.docx
@@ -222,7 +222,7 @@
                 <w:rFonts w:ascii="Times New Roman" w:hAnsi="Times New Roman"/>
                 <w:sz w:val="18"/>
               </w:rPr>
-              <w:t>[Name 1]  |  [Name 2]  |  [Name 3]</w:t>
+              <w:t>Enter Name 1 Here  |  Enter Name 2 Here  |  Enter Name 3 Here</w:t>
             </w:r>
           </w:p>
         </w:tc>
@@ -252,7 +252,7 @@
                 <w:rFonts w:ascii="Times New Roman" w:hAnsi="Times New Roman"/>
                 <w:sz w:val="18"/>
               </w:rPr>
-              <w:t>[Roll No. 1]  |  [Roll No. 2]  |  [Roll No. 3]</w:t>
+              <w:t>Enter Roll 1 Here  |  Enter Roll 2 Here  |  Enter Roll 3 Here</w:t>
             </w:r>
           </w:p>
         </w:tc>
@@ -282,7 +282,7 @@
                 <w:rFonts w:ascii="Times New Roman" w:hAnsi="Times New Roman"/>
                 <w:sz w:val="18"/>
               </w:rPr>
-              <w:t>[DD/MM/YYYY]</w:t>
+              <w:t>24th April 2026</w:t>
             </w:r>
           </w:p>
         </w:tc>
@@ -662,6 +662,42 @@
           <w:sz w:val="22"/>
         </w:rPr>
         <w:t>Four user roles are supported: Clinical, Research, Administrative, and Legal — each receiving a filtered view.</w:t>
+      </w:r>
+    </w:p>
+    <w:p>
+      <w:pPr>
+        <w:pStyle w:val="ListBullet"/>
+      </w:pPr>
+      <w:r>
+        <w:rPr>
+          <w:rFonts w:ascii="Times New Roman" w:hAnsi="Times New Roman"/>
+          <w:sz w:val="22"/>
+        </w:rPr>
+        <w:t>Advanced Patient Filtering: Supports dynamic NoSQL/SQL querying ($in, $gte) for complex clinical searches.</w:t>
+      </w:r>
+    </w:p>
+    <w:p>
+      <w:pPr>
+        <w:pStyle w:val="ListBullet"/>
+      </w:pPr>
+      <w:r>
+        <w:rPr>
+          <w:rFonts w:ascii="Times New Roman" w:hAnsi="Times New Roman"/>
+          <w:sz w:val="22"/>
+        </w:rPr>
+        <w:t>Security Audit Heatmap: Tracks Role-Based actions (Searches, Exports) and visualizes them natively.</w:t>
+      </w:r>
+    </w:p>
+    <w:p>
+      <w:pPr>
+        <w:pStyle w:val="ListBullet"/>
+      </w:pPr>
+      <w:r>
+        <w:rPr>
+          <w:rFonts w:ascii="Times New Roman" w:hAnsi="Times New Roman"/>
+          <w:sz w:val="22"/>
+        </w:rPr>
+        <w:t>1-Click PDF Export: Clinical and Legal subpoenas can be downloaded as formatted PDF documents directly from the UI.</w:t>
       </w:r>
     </w:p>
     <w:p>
@@ -8503,7 +8539,7 @@
           <w:i/>
           <w:sz w:val="22"/>
         </w:rPr>
-        <w:t>[ Screenshot 1 – Clinical Role: Patient Context View showing full name, disease, medication, and EHR diagnosis notes for patient P-10022-B (Sarah Mitchell) ]</w:t>
+        <w:t>[ Screenshot 1 – Clinical Role: Patient Context View showing Advanced Search and 1-Click PDF Export for patient P-10022-B ]</w:t>
       </w:r>
     </w:p>
     <w:p>
@@ -8517,7 +8553,7 @@
           <w:i/>
           <w:sz w:val="22"/>
         </w:rPr>
-        <w:t>[ Screenshot 2 – Research Role: Anonymized Dataset showing SHA-256 hashed IDs, age buckets (e.g. 30-39), disease categories, and Disease Demographics chart ]</w:t>
+        <w:t>[ Screenshot 2 – Research Role: Anonymized Dataset showing SHA-256 hashed IDs, age buckets (e.g. 30-39) ]</w:t>
       </w:r>
     </w:p>
     <w:p>
@@ -8531,7 +8567,7 @@
           <w:i/>
           <w:sz w:val="22"/>
         </w:rPr>
-        <w:t>[ Screenshot 3 – Trigger Output: AuditLog table auto-populated after ClinicalSummary insert displaying role_id, patient_id, action=VIEW_SUMMARY, and logged_at timestamp ]</w:t>
+        <w:t>[ Screenshot 3 – Admin Role: Security Audit Heatmap displaying tracked Role actions ]</w:t>
       </w:r>
     </w:p>
     <w:p>
@@ -8545,7 +8581,7 @@
           <w:i/>
           <w:sz w:val="22"/>
         </w:rPr>
-        <w:t>[ Screenshot 4 – Stored Procedure: CALL GetSummaryByRole result showing filtered patient data and @status = SUCCESS ]</w:t>
+        <w:t>[ Screenshot 4 – Legal Role: Subpoena Extraction with specific columns and PDF export capability ]</w:t>
       </w:r>
     </w:p>
     <w:p>
@@ -8898,7 +8934,7 @@
                 <w:rFonts w:ascii="Times New Roman" w:hAnsi="Times New Roman"/>
                 <w:sz w:val="18"/>
               </w:rPr>
-              <w:t>[Name 1]</w:t>
+              <w:t>Enter Name 1 Here</w:t>
             </w:r>
           </w:p>
         </w:tc>
@@ -8912,7 +8948,7 @@
                 <w:rFonts w:ascii="Times New Roman" w:hAnsi="Times New Roman"/>
                 <w:sz w:val="18"/>
               </w:rPr>
-              <w:t>[Roll No. 1]</w:t>
+              <w:t>Enter Roll 1 Here</w:t>
             </w:r>
           </w:p>
         </w:tc>
@@ -8926,7 +8962,7 @@
                 <w:rFonts w:ascii="Times New Roman" w:hAnsi="Times New Roman"/>
                 <w:sz w:val="18"/>
               </w:rPr>
-              <w:t>Schema Design, ER Diagram, DDL Scripts, Normalization</w:t>
+              <w:t>Database Schema Design, ER Diagram, DDL Scripts, Normalization (database.py)</w:t>
             </w:r>
           </w:p>
         </w:tc>
@@ -8942,7 +8978,7 @@
                 <w:rFonts w:ascii="Times New Roman" w:hAnsi="Times New Roman"/>
                 <w:sz w:val="18"/>
               </w:rPr>
-              <w:t>[Name 2]</w:t>
+              <w:t>Enter Name 2 Here</w:t>
             </w:r>
           </w:p>
         </w:tc>
@@ -8956,7 +8992,7 @@
                 <w:rFonts w:ascii="Times New Roman" w:hAnsi="Times New Roman"/>
                 <w:sz w:val="18"/>
               </w:rPr>
-              <w:t>[Roll No. 2]</w:t>
+              <w:t>Enter Roll 2 Here</w:t>
             </w:r>
           </w:p>
         </w:tc>
@@ -8970,7 +9006,7 @@
                 <w:rFonts w:ascii="Times New Roman" w:hAnsi="Times New Roman"/>
                 <w:sz w:val="18"/>
               </w:rPr>
-              <w:t>DML Data Seeding, SQL Queries (Q-01 to Q-05), Testing</w:t>
+              <w:t>DML Data Seeding, Anonymization Security Rules, SQL Queries (seed_db.py, anonymization.py)</w:t>
             </w:r>
           </w:p>
         </w:tc>
@@ -8986,7 +9022,7 @@
                 <w:rFonts w:ascii="Times New Roman" w:hAnsi="Times New Roman"/>
                 <w:sz w:val="18"/>
               </w:rPr>
-              <w:t>[Name 3]</w:t>
+              <w:t>Enter Name 3 Here</w:t>
             </w:r>
           </w:p>
         </w:tc>
@@ -9000,7 +9036,7 @@
                 <w:rFonts w:ascii="Times New Roman" w:hAnsi="Times New Roman"/>
                 <w:sz w:val="18"/>
               </w:rPr>
-              <w:t>[Roll No. 3]</w:t>
+              <w:t>Enter Roll 3 Here</w:t>
             </w:r>
           </w:p>
         </w:tc>
@@ -9014,7 +9050,7 @@
                 <w:rFonts w:ascii="Times New Roman" w:hAnsi="Times New Roman"/>
                 <w:sz w:val="18"/>
               </w:rPr>
-              <w:t>Triggers, Stored Procedures, Views, Streamlit Frontend, Report</w:t>
+              <w:t>Streamlit Frontend, Role-Based Views, Triggers/Procedures UI Auth (app.py, views/)</w:t>
             </w:r>
           </w:p>
         </w:tc>

</xml_diff>